<commit_message>
email-auth-setup.md >## A. コードの繁栄（最初に行う） > 3.
</commit_message>
<xml_diff>
--- a/docs/卒論(参考資料)/新しい端末環境で作業する際に必要な作業.docx
+++ b/docs/卒論(参考資料)/新しい端末環境で作業する際に必要な作業.docx
@@ -5,9 +5,6 @@
     <w:p>
       <w:pPr>
         <w:ind w:left="360" w:hanging="360"/>
-        <w:rPr>
-          <w:rFonts w:hint="eastAsia"/>
-        </w:rPr>
       </w:pPr>
       <w:r>
         <w:rPr>
@@ -27,7 +24,7 @@
       <w:r>
         <w:t xml:space="preserve">  </w:t>
       </w:r>
-      <w:hyperlink r:id="rId5" w:history="1">
+      <w:hyperlink r:id="rId7" w:history="1">
         <w:r>
           <w:rPr>
             <w:rStyle w:val="aa"/>
@@ -42,14 +39,63 @@
     <w:p>
       <w:pPr>
         <w:pStyle w:val="a9"/>
+        <w:ind w:left="360"/>
+        <w:rPr>
+          <w:b/>
+          <w:bCs/>
+        </w:rPr>
+      </w:pPr>
+      <w:r>
+        <w:rPr>
+          <w:b/>
+          <w:bCs/>
+        </w:rPr>
+        <w:t>バージョンの選び方</w:t>
+      </w:r>
+    </w:p>
+    <w:p>
+      <w:pPr>
+        <w:pStyle w:val="a9"/>
         <w:numPr>
           <w:ilvl w:val="0"/>
-          <w:numId w:val="1"/>
+          <w:numId w:val="2"/>
         </w:numPr>
       </w:pPr>
       <w:r>
-        <w:t xml:space="preserve">  インストール時に「Add to PATH」にチェックが入っていることを確認 </w:t>
-      </w:r>
+        <w:rPr>
+          <w:b/>
+          <w:bCs/>
+        </w:rPr>
+        <w:t>LTS版（v24）</w:t>
+      </w:r>
+      <w:r>
+        <w:t>：長期サポート版です。安定していて、ほとんどのライブラリやツールが対応しています。学習、業務、普段の開発ならこちらを選んでください。</w:t>
+      </w:r>
+    </w:p>
+    <w:p>
+      <w:pPr>
+        <w:pStyle w:val="a9"/>
+        <w:numPr>
+          <w:ilvl w:val="0"/>
+          <w:numId w:val="2"/>
+        </w:numPr>
+      </w:pPr>
+      <w:r>
+        <w:rPr>
+          <w:b/>
+          <w:bCs/>
+        </w:rPr>
+        <w:t>最新版（v26）</w:t>
+      </w:r>
+      <w:r>
+        <w:t>：新機能をいち早く試せますが、一部のパッケージが未対応のことがあります。新機能を試したい場合以外は不要です。</w:t>
+      </w:r>
+    </w:p>
+    <w:p>
+      <w:pPr>
+        <w:pStyle w:val="a9"/>
+        <w:ind w:left="360"/>
+      </w:pPr>
     </w:p>
     <w:p>
       <w:pPr>
@@ -60,6 +106,24 @@
         </w:numPr>
       </w:pPr>
       <w:r>
+        <w:t xml:space="preserve">  インストール時に「Add to PATH」にチェックが入っていることを確認 </w:t>
+      </w:r>
+      <w:r>
+        <w:rPr>
+          <w:rFonts w:hint="eastAsia"/>
+        </w:rPr>
+        <w:t>(基本すべて「next」で進める</w:t>
+      </w:r>
+    </w:p>
+    <w:p>
+      <w:pPr>
+        <w:pStyle w:val="a9"/>
+        <w:numPr>
+          <w:ilvl w:val="0"/>
+          <w:numId w:val="1"/>
+        </w:numPr>
+      </w:pPr>
+      <w:r>
         <w:t xml:space="preserve">  </w:t>
       </w:r>
       <w:r>
@@ -121,13 +185,7 @@
         <w:br/>
       </w:r>
     </w:p>
-    <w:p>
-      <w:pPr>
-        <w:rPr>
-          <w:rFonts w:hint="eastAsia"/>
-        </w:rPr>
-      </w:pPr>
-    </w:p>
+    <w:p/>
     <w:sectPr>
       <w:pgSz w:w="11906" w:h="16838"/>
       <w:pgMar w:top="1985" w:right="1701" w:bottom="1701" w:left="1701" w:header="851" w:footer="992" w:gutter="0"/>
@@ -138,9 +196,208 @@
 </w:document>
 </file>
 
+<file path=word/endnotes.xml><?xml version="1.0" encoding="utf-8"?>
+<w:endnotes xmlns:wpc="http://schemas.microsoft.com/office/word/2010/wordprocessingCanvas" xmlns:cx="http://schemas.microsoft.com/office/drawing/2014/chartex" xmlns:cx1="http://schemas.microsoft.com/office/drawing/2015/9/8/chartex" xmlns:cx2="http://schemas.microsoft.com/office/drawing/2015/10/21/chartex" xmlns:cx3="http://schemas.microsoft.com/office/drawing/2016/5/9/chartex" xmlns:cx4="http://schemas.microsoft.com/office/drawing/2016/5/10/chartex" xmlns:cx5="http://schemas.microsoft.com/office/drawing/2016/5/11/chartex" xmlns:cx6="http://schemas.microsoft.com/office/drawing/2016/5/12/chartex" xmlns:cx7="http://schemas.microsoft.com/office/drawing/2016/5/13/chartex" xmlns:cx8="http://schemas.microsoft.com/office/drawing/2016/5/14/chartex" xmlns:mc="http://schemas.openxmlformats.org/markup-compatibility/2006" xmlns:aink="http://schemas.microsoft.com/office/drawing/2016/ink" xmlns:am3d="http://schemas.microsoft.com/office/drawing/2017/model3d" xmlns:o="urn:schemas-microsoft-com:office:office" xmlns:oel="http://schemas.microsoft.com/office/2019/extlst" xmlns:r="http://schemas.openxmlformats.org/officeDocument/2006/relationships" xmlns:m="http://schemas.openxmlformats.org/officeDocument/2006/math" xmlns:v="urn:schemas-microsoft-com:vml" xmlns:wp14="http://schemas.microsoft.com/office/word/2010/wordprocessingDrawing" xmlns:wp="http://schemas.openxmlformats.org/drawingml/2006/wordprocessingDrawing" xmlns:w10="urn:schemas-microsoft-com:office:word" xmlns:w="http://schemas.openxmlformats.org/wordprocessingml/2006/main" xmlns:w14="http://schemas.microsoft.com/office/word/2010/wordml" xmlns:w15="http://schemas.microsoft.com/office/word/2012/wordml" xmlns:w16cex="http://schemas.microsoft.com/office/word/2018/wordml/cex" xmlns:w16cid="http://schemas.microsoft.com/office/word/2016/wordml/cid" xmlns:w16="http://schemas.microsoft.com/office/word/2018/wordml" xmlns:w16sdtdh="http://schemas.microsoft.com/office/word/2020/wordml/sdtdatahash" xmlns:w16se="http://schemas.microsoft.com/office/word/2015/wordml/symex" xmlns:wpg="http://schemas.microsoft.com/office/word/2010/wordprocessingGroup" xmlns:wpi="http://schemas.microsoft.com/office/word/2010/wordprocessingInk" xmlns:wne="http://schemas.microsoft.com/office/word/2006/wordml" xmlns:wps="http://schemas.microsoft.com/office/word/2010/wordprocessingShape" mc:Ignorable="w14 w15 w16se w16cid w16 w16cex w16sdtdh wp14">
+  <w:endnote w:type="separator" w:id="-1">
+    <w:p>
+      <w:pPr>
+        <w:spacing w:after="0" w:line="240" w:lineRule="auto"/>
+      </w:pPr>
+      <w:r>
+        <w:separator/>
+      </w:r>
+    </w:p>
+  </w:endnote>
+  <w:endnote w:type="continuationSeparator" w:id="0">
+    <w:p>
+      <w:pPr>
+        <w:spacing w:after="0" w:line="240" w:lineRule="auto"/>
+      </w:pPr>
+      <w:r>
+        <w:continuationSeparator/>
+      </w:r>
+    </w:p>
+  </w:endnote>
+</w:endnotes>
+</file>
+
+<file path=word/footnotes.xml><?xml version="1.0" encoding="utf-8"?>
+<w:footnotes xmlns:wpc="http://schemas.microsoft.com/office/word/2010/wordprocessingCanvas" xmlns:cx="http://schemas.microsoft.com/office/drawing/2014/chartex" xmlns:cx1="http://schemas.microsoft.com/office/drawing/2015/9/8/chartex" xmlns:cx2="http://schemas.microsoft.com/office/drawing/2015/10/21/chartex" xmlns:cx3="http://schemas.microsoft.com/office/drawing/2016/5/9/chartex" xmlns:cx4="http://schemas.microsoft.com/office/drawing/2016/5/10/chartex" xmlns:cx5="http://schemas.microsoft.com/office/drawing/2016/5/11/chartex" xmlns:cx6="http://schemas.microsoft.com/office/drawing/2016/5/12/chartex" xmlns:cx7="http://schemas.microsoft.com/office/drawing/2016/5/13/chartex" xmlns:cx8="http://schemas.microsoft.com/office/drawing/2016/5/14/chartex" xmlns:mc="http://schemas.openxmlformats.org/markup-compatibility/2006" xmlns:aink="http://schemas.microsoft.com/office/drawing/2016/ink" xmlns:am3d="http://schemas.microsoft.com/office/drawing/2017/model3d" xmlns:o="urn:schemas-microsoft-com:office:office" xmlns:oel="http://schemas.microsoft.com/office/2019/extlst" xmlns:r="http://schemas.openxmlformats.org/officeDocument/2006/relationships" xmlns:m="http://schemas.openxmlformats.org/officeDocument/2006/math" xmlns:v="urn:schemas-microsoft-com:vml" xmlns:wp14="http://schemas.microsoft.com/office/word/2010/wordprocessingDrawing" xmlns:wp="http://schemas.openxmlformats.org/drawingml/2006/wordprocessingDrawing" xmlns:w10="urn:schemas-microsoft-com:office:word" xmlns:w="http://schemas.openxmlformats.org/wordprocessingml/2006/main" xmlns:w14="http://schemas.microsoft.com/office/word/2010/wordml" xmlns:w15="http://schemas.microsoft.com/office/word/2012/wordml" xmlns:w16cex="http://schemas.microsoft.com/office/word/2018/wordml/cex" xmlns:w16cid="http://schemas.microsoft.com/office/word/2016/wordml/cid" xmlns:w16="http://schemas.microsoft.com/office/word/2018/wordml" xmlns:w16sdtdh="http://schemas.microsoft.com/office/word/2020/wordml/sdtdatahash" xmlns:w16se="http://schemas.microsoft.com/office/word/2015/wordml/symex" xmlns:wpg="http://schemas.microsoft.com/office/word/2010/wordprocessingGroup" xmlns:wpi="http://schemas.microsoft.com/office/word/2010/wordprocessingInk" xmlns:wne="http://schemas.microsoft.com/office/word/2006/wordml" xmlns:wps="http://schemas.microsoft.com/office/word/2010/wordprocessingShape" mc:Ignorable="w14 w15 w16se w16cid w16 w16cex w16sdtdh wp14">
+  <w:footnote w:type="separator" w:id="-1">
+    <w:p>
+      <w:pPr>
+        <w:spacing w:after="0" w:line="240" w:lineRule="auto"/>
+      </w:pPr>
+      <w:r>
+        <w:separator/>
+      </w:r>
+    </w:p>
+  </w:footnote>
+  <w:footnote w:type="continuationSeparator" w:id="0">
+    <w:p>
+      <w:pPr>
+        <w:spacing w:after="0" w:line="240" w:lineRule="auto"/>
+      </w:pPr>
+      <w:r>
+        <w:continuationSeparator/>
+      </w:r>
+    </w:p>
+  </w:footnote>
+</w:footnotes>
+</file>
+
 <file path=word/numbering.xml><?xml version="1.0" encoding="utf-8"?>
 <w:numbering xmlns:wpc="http://schemas.microsoft.com/office/word/2010/wordprocessingCanvas" xmlns:cx="http://schemas.microsoft.com/office/drawing/2014/chartex" xmlns:cx1="http://schemas.microsoft.com/office/drawing/2015/9/8/chartex" xmlns:cx2="http://schemas.microsoft.com/office/drawing/2015/10/21/chartex" xmlns:cx3="http://schemas.microsoft.com/office/drawing/2016/5/9/chartex" xmlns:cx4="http://schemas.microsoft.com/office/drawing/2016/5/10/chartex" xmlns:cx5="http://schemas.microsoft.com/office/drawing/2016/5/11/chartex" xmlns:cx6="http://schemas.microsoft.com/office/drawing/2016/5/12/chartex" xmlns:cx7="http://schemas.microsoft.com/office/drawing/2016/5/13/chartex" xmlns:cx8="http://schemas.microsoft.com/office/drawing/2016/5/14/chartex" xmlns:mc="http://schemas.openxmlformats.org/markup-compatibility/2006" xmlns:aink="http://schemas.microsoft.com/office/drawing/2016/ink" xmlns:am3d="http://schemas.microsoft.com/office/drawing/2017/model3d" xmlns:o="urn:schemas-microsoft-com:office:office" xmlns:oel="http://schemas.microsoft.com/office/2019/extlst" xmlns:r="http://schemas.openxmlformats.org/officeDocument/2006/relationships" xmlns:m="http://schemas.openxmlformats.org/officeDocument/2006/math" xmlns:v="urn:schemas-microsoft-com:vml" xmlns:wp14="http://schemas.microsoft.com/office/word/2010/wordprocessingDrawing" xmlns:wp="http://schemas.openxmlformats.org/drawingml/2006/wordprocessingDrawing" xmlns:w10="urn:schemas-microsoft-com:office:word" xmlns:w="http://schemas.openxmlformats.org/wordprocessingml/2006/main" xmlns:w14="http://schemas.microsoft.com/office/word/2010/wordml" xmlns:w15="http://schemas.microsoft.com/office/word/2012/wordml" xmlns:w16cex="http://schemas.microsoft.com/office/word/2018/wordml/cex" xmlns:w16cid="http://schemas.microsoft.com/office/word/2016/wordml/cid" xmlns:w16="http://schemas.microsoft.com/office/word/2018/wordml" xmlns:w16sdtdh="http://schemas.microsoft.com/office/word/2020/wordml/sdtdatahash" xmlns:w16se="http://schemas.microsoft.com/office/word/2015/wordml/symex" xmlns:wpg="http://schemas.microsoft.com/office/word/2010/wordprocessingGroup" xmlns:wpi="http://schemas.microsoft.com/office/word/2010/wordprocessingInk" xmlns:wne="http://schemas.microsoft.com/office/word/2006/wordml" xmlns:wps="http://schemas.microsoft.com/office/word/2010/wordprocessingShape" mc:Ignorable="w14 w15 w16se w16cid w16 w16cex w16sdtdh wp14">
   <w:abstractNum w:abstractNumId="0" w15:restartNumberingAfterBreak="0">
+    <w:nsid w:val="3DC3342F"/>
+    <w:multiLevelType w:val="multilevel"/>
+    <w:tmpl w:val="3D72BF1C"/>
+    <w:lvl w:ilvl="0">
+      <w:start w:val="1"/>
+      <w:numFmt w:val="bullet"/>
+      <w:lvlText w:val=""/>
+      <w:lvlJc w:val="left"/>
+      <w:pPr>
+        <w:tabs>
+          <w:tab w:val="num" w:pos="720"/>
+        </w:tabs>
+        <w:ind w:left="720" w:hanging="360"/>
+      </w:pPr>
+      <w:rPr>
+        <w:rFonts w:ascii="Symbol" w:hAnsi="Symbol" w:hint="default"/>
+        <w:sz w:val="20"/>
+      </w:rPr>
+    </w:lvl>
+    <w:lvl w:ilvl="1" w:tentative="1">
+      <w:start w:val="1"/>
+      <w:numFmt w:val="bullet"/>
+      <w:lvlText w:val="o"/>
+      <w:lvlJc w:val="left"/>
+      <w:pPr>
+        <w:tabs>
+          <w:tab w:val="num" w:pos="1440"/>
+        </w:tabs>
+        <w:ind w:left="1440" w:hanging="360"/>
+      </w:pPr>
+      <w:rPr>
+        <w:rFonts w:ascii="Courier New" w:hAnsi="Courier New" w:hint="default"/>
+        <w:sz w:val="20"/>
+      </w:rPr>
+    </w:lvl>
+    <w:lvl w:ilvl="2" w:tentative="1">
+      <w:start w:val="1"/>
+      <w:numFmt w:val="bullet"/>
+      <w:lvlText w:val=""/>
+      <w:lvlJc w:val="left"/>
+      <w:pPr>
+        <w:tabs>
+          <w:tab w:val="num" w:pos="2160"/>
+        </w:tabs>
+        <w:ind w:left="2160" w:hanging="360"/>
+      </w:pPr>
+      <w:rPr>
+        <w:rFonts w:ascii="Wingdings" w:hAnsi="Wingdings" w:hint="default"/>
+        <w:sz w:val="20"/>
+      </w:rPr>
+    </w:lvl>
+    <w:lvl w:ilvl="3" w:tentative="1">
+      <w:start w:val="1"/>
+      <w:numFmt w:val="bullet"/>
+      <w:lvlText w:val=""/>
+      <w:lvlJc w:val="left"/>
+      <w:pPr>
+        <w:tabs>
+          <w:tab w:val="num" w:pos="2880"/>
+        </w:tabs>
+        <w:ind w:left="2880" w:hanging="360"/>
+      </w:pPr>
+      <w:rPr>
+        <w:rFonts w:ascii="Wingdings" w:hAnsi="Wingdings" w:hint="default"/>
+        <w:sz w:val="20"/>
+      </w:rPr>
+    </w:lvl>
+    <w:lvl w:ilvl="4" w:tentative="1">
+      <w:start w:val="1"/>
+      <w:numFmt w:val="bullet"/>
+      <w:lvlText w:val=""/>
+      <w:lvlJc w:val="left"/>
+      <w:pPr>
+        <w:tabs>
+          <w:tab w:val="num" w:pos="3600"/>
+        </w:tabs>
+        <w:ind w:left="3600" w:hanging="360"/>
+      </w:pPr>
+      <w:rPr>
+        <w:rFonts w:ascii="Wingdings" w:hAnsi="Wingdings" w:hint="default"/>
+        <w:sz w:val="20"/>
+      </w:rPr>
+    </w:lvl>
+    <w:lvl w:ilvl="5" w:tentative="1">
+      <w:start w:val="1"/>
+      <w:numFmt w:val="bullet"/>
+      <w:lvlText w:val=""/>
+      <w:lvlJc w:val="left"/>
+      <w:pPr>
+        <w:tabs>
+          <w:tab w:val="num" w:pos="4320"/>
+        </w:tabs>
+        <w:ind w:left="4320" w:hanging="360"/>
+      </w:pPr>
+      <w:rPr>
+        <w:rFonts w:ascii="Wingdings" w:hAnsi="Wingdings" w:hint="default"/>
+        <w:sz w:val="20"/>
+      </w:rPr>
+    </w:lvl>
+    <w:lvl w:ilvl="6" w:tentative="1">
+      <w:start w:val="1"/>
+      <w:numFmt w:val="bullet"/>
+      <w:lvlText w:val=""/>
+      <w:lvlJc w:val="left"/>
+      <w:pPr>
+        <w:tabs>
+          <w:tab w:val="num" w:pos="5040"/>
+        </w:tabs>
+        <w:ind w:left="5040" w:hanging="360"/>
+      </w:pPr>
+      <w:rPr>
+        <w:rFonts w:ascii="Wingdings" w:hAnsi="Wingdings" w:hint="default"/>
+        <w:sz w:val="20"/>
+      </w:rPr>
+    </w:lvl>
+    <w:lvl w:ilvl="7" w:tentative="1">
+      <w:start w:val="1"/>
+      <w:numFmt w:val="bullet"/>
+      <w:lvlText w:val=""/>
+      <w:lvlJc w:val="left"/>
+      <w:pPr>
+        <w:tabs>
+          <w:tab w:val="num" w:pos="5760"/>
+        </w:tabs>
+        <w:ind w:left="5760" w:hanging="360"/>
+      </w:pPr>
+      <w:rPr>
+        <w:rFonts w:ascii="Wingdings" w:hAnsi="Wingdings" w:hint="default"/>
+        <w:sz w:val="20"/>
+      </w:rPr>
+    </w:lvl>
+    <w:lvl w:ilvl="8" w:tentative="1">
+      <w:start w:val="1"/>
+      <w:numFmt w:val="bullet"/>
+      <w:lvlText w:val=""/>
+      <w:lvlJc w:val="left"/>
+      <w:pPr>
+        <w:tabs>
+          <w:tab w:val="num" w:pos="6480"/>
+        </w:tabs>
+        <w:ind w:left="6480" w:hanging="360"/>
+      </w:pPr>
+      <w:rPr>
+        <w:rFonts w:ascii="Wingdings" w:hAnsi="Wingdings" w:hint="default"/>
+        <w:sz w:val="20"/>
+      </w:rPr>
+    </w:lvl>
+  </w:abstractNum>
+  <w:abstractNum w:abstractNumId="1" w15:restartNumberingAfterBreak="0">
     <w:nsid w:val="7F716633"/>
     <w:multiLevelType w:val="hybridMultilevel"/>
     <w:tmpl w:val="270E8B0A"/>
@@ -230,6 +487,9 @@
     </w:lvl>
   </w:abstractNum>
   <w:num w:numId="1" w16cid:durableId="2054498582">
+    <w:abstractNumId w:val="1"/>
+  </w:num>
+  <w:num w:numId="2" w16cid:durableId="289090775">
     <w:abstractNumId w:val="0"/>
   </w:num>
 </w:numbering>
@@ -839,6 +1099,7 @@
   <w:style w:type="character" w:default="1" w:styleId="a0">
     <w:name w:val="Default Paragraph Font"/>
     <w:uiPriority w:val="1"/>
+    <w:semiHidden/>
     <w:unhideWhenUsed/>
   </w:style>
   <w:style w:type="table" w:default="1" w:styleId="a1">
@@ -1168,6 +1429,62 @@
     <w:rPr>
       <w:color w:val="605E5C"/>
       <w:shd w:val="clear" w:color="auto" w:fill="E1DFDD"/>
+    </w:rPr>
+  </w:style>
+  <w:style w:type="paragraph" w:styleId="ac">
+    <w:name w:val="header"/>
+    <w:basedOn w:val="a"/>
+    <w:link w:val="ad"/>
+    <w:uiPriority w:val="99"/>
+    <w:unhideWhenUsed/>
+    <w:rsid w:val="0001087D"/>
+    <w:pPr>
+      <w:tabs>
+        <w:tab w:val="center" w:pos="4252"/>
+        <w:tab w:val="right" w:pos="8504"/>
+      </w:tabs>
+      <w:snapToGrid w:val="0"/>
+    </w:pPr>
+  </w:style>
+  <w:style w:type="character" w:customStyle="1" w:styleId="ad">
+    <w:name w:val="ヘッダー (文字)"/>
+    <w:basedOn w:val="a0"/>
+    <w:link w:val="ac"/>
+    <w:uiPriority w:val="99"/>
+    <w:rsid w:val="0001087D"/>
+  </w:style>
+  <w:style w:type="paragraph" w:styleId="ae">
+    <w:name w:val="footer"/>
+    <w:basedOn w:val="a"/>
+    <w:link w:val="af"/>
+    <w:uiPriority w:val="99"/>
+    <w:unhideWhenUsed/>
+    <w:rsid w:val="0001087D"/>
+    <w:pPr>
+      <w:tabs>
+        <w:tab w:val="center" w:pos="4252"/>
+        <w:tab w:val="right" w:pos="8504"/>
+      </w:tabs>
+      <w:snapToGrid w:val="0"/>
+    </w:pPr>
+  </w:style>
+  <w:style w:type="character" w:customStyle="1" w:styleId="af">
+    <w:name w:val="フッター (文字)"/>
+    <w:basedOn w:val="a0"/>
+    <w:link w:val="ae"/>
+    <w:uiPriority w:val="99"/>
+    <w:rsid w:val="0001087D"/>
+  </w:style>
+  <w:style w:type="character" w:styleId="af0">
+    <w:name w:val="FollowedHyperlink"/>
+    <w:basedOn w:val="a0"/>
+    <w:uiPriority w:val="99"/>
+    <w:semiHidden/>
+    <w:unhideWhenUsed/>
+    <w:rsid w:val="0001087D"/>
+    <w:rPr>
+      <w:color w:val="96607D" w:themeColor="followedHyperlink"/>
+      <w:u w:val="single"/>
     </w:rPr>
   </w:style>
 </w:styles>

</xml_diff>